<commit_message>
refactor: update embroidery details handling and improve pairing logic
- Removed the `findMissingImages` function from `catalogKeys.ts` as it was no longer needed.
- Enhanced `AiStudioView.tsx` to include detailed error handling for embroidery options, ensuring required fields are filled before saving.
- Updated the `CollectionDetails.tsx` to reflect changes in how embroidery details are structured, including new pairing fields for neck, sleeve, length, lower, dupatta, and colour.
- Modified `PhotoSlots.tsx` to include a new 'lower' slot for salwar/pajama.
- Adjusted `PositionMap.tsx` to visually represent the lower garment in the embroidery position map.
- Refined `CreateDesignShell.tsx` to improve the pairing logic between design steps, ensuring that selections in earlier steps correctly filter options in subsequent steps.
- Removed unused flag emoji utility from `countries.ts` to clean up the codebase.
</commit_message>
<xml_diff>
--- a/docs/client-kit/admin-panel-guide.docx
+++ b/docs/client-kit/admin-panel-guide.docx
@@ -438,6 +438,127 @@
                 <w:sz w:val="18"/>
               </w:rPr>
               <w:t>Where you and your team manage everything in this guide. Sign in with your email and password.</w:t>
+            </w:r>
+          </w:p>
+        </w:tc>
+      </w:tr>
+    </w:tbl>
+    <w:p>
+      <w:pPr>
+        <w:spacing w:after="40"/>
+      </w:pPr>
+    </w:p>
+    <w:tbl>
+      <w:tblPr>
+        <w:tblLook w:firstColumn="1" w:firstRow="1" w:lastColumn="0" w:lastRow="0" w:noHBand="0" w:noVBand="1" w:val="04A0"/>
+        <w:jc w:val="center"/>
+        <w:tblBorders>
+          <w:top w:val="nil"/>
+          <w:left w:val="nil"/>
+          <w:bottom w:val="nil"/>
+          <w:right w:val="nil"/>
+          <w:insideH w:val="nil"/>
+          <w:insideV w:val="nil"/>
+        </w:tblBorders>
+        <w:tblW w:w="9865" w:type="dxa"/>
+        <w:tblLayout w:type="fixed"/>
+        <w:tblCellMar>
+          <w:top w:w="120" w:type="dxa"/>
+          <w:bottom w:w="120" w:type="dxa"/>
+          <w:left w:w="160" w:type="dxa"/>
+          <w:right w:w="160" w:type="dxa"/>
+        </w:tblCellMar>
+      </w:tblPr>
+      <w:tblGrid>
+        <w:gridCol w:w="9866"/>
+      </w:tblGrid>
+      <w:tr>
+        <w:tc>
+          <w:tcPr>
+            <w:tcW w:type="dxa" w:w="9865"/>
+            <w:shd w:val="clear" w:color="auto" w:fill="E0F1DC"/>
+          </w:tcPr>
+          <w:p>
+            <w:r>
+              <w:rPr>
+                <w:b/>
+                <w:color w:val="2F5A2A"/>
+              </w:rPr>
+              <w:t>Which dashboard?</w:t>
+            </w:r>
+          </w:p>
+          <w:p>
+            <w:pPr>
+              <w:spacing w:after="60"/>
+            </w:pPr>
+            <w:r>
+              <w:rPr>
+                <w:sz w:val="19"/>
+              </w:rPr>
+              <w:t xml:space="preserve">Everything in this guide is done in the </w:t>
+            </w:r>
+            <w:r>
+              <w:rPr>
+                <w:b/>
+                <w:sz w:val="19"/>
+              </w:rPr>
+              <w:t>Baliye admin panel</w:t>
+            </w:r>
+            <w:r>
+              <w:rPr>
+                <w:sz w:val="19"/>
+              </w:rPr>
+              <w:t xml:space="preserve"> above, not in the Shopify admin. AI Studio, the Design Builder, measurements, website words and pictures, the newsletter, design credits and your team all live here.</w:t>
+            </w:r>
+          </w:p>
+          <w:p>
+            <w:pPr>
+              <w:spacing w:after="60"/>
+            </w:pPr>
+            <w:r>
+              <w:rPr>
+                <w:sz w:val="19"/>
+              </w:rPr>
+              <w:t xml:space="preserve">Shopify is still where you manage the </w:t>
+            </w:r>
+            <w:r>
+              <w:rPr>
+                <w:b/>
+                <w:sz w:val="19"/>
+              </w:rPr>
+              <w:t>pre-made products</w:t>
+            </w:r>
+            <w:r>
+              <w:rPr>
+                <w:sz w:val="19"/>
+              </w:rPr>
+              <w:t xml:space="preserve"> (their names, prices, photos and tags), </w:t>
+            </w:r>
+            <w:r>
+              <w:rPr>
+                <w:b/>
+                <w:sz w:val="19"/>
+              </w:rPr>
+              <w:t>orders</w:t>
+            </w:r>
+            <w:r>
+              <w:rPr>
+                <w:sz w:val="19"/>
+              </w:rPr>
+              <w:t xml:space="preserve"> and </w:t>
+            </w:r>
+            <w:r>
+              <w:rPr>
+                <w:b/>
+                <w:sz w:val="19"/>
+              </w:rPr>
+              <w:t>payments</w:t>
+            </w:r>
+            <w:r>
+              <w:rPr>
+                <w:sz w:val="19"/>
+              </w:rPr>
+              <w:t>. The website reads those from Shopify automatically.</w:t>
             </w:r>
           </w:p>
         </w:tc>
@@ -1066,7 +1187,7 @@
               <w:rPr>
                 <w:sz w:val="18"/>
               </w:rPr>
-              <w:t>Add or remove people who can sign in to this panel.</w:t>
+              <w:t>Add or remove people who can sign in to this panel, including other owner accounts.</w:t>
             </w:r>
           </w:p>
         </w:tc>
@@ -1355,7 +1476,7 @@
               <w:rPr>
                 <w:sz w:val="18"/>
               </w:rPr>
-              <w:t xml:space="preserve">Name it, tick its necklines, write details, add photos, press </w:t>
+              <w:t xml:space="preserve">Name it, tick what it goes with (neck, sleeve, length or lower, and optionally colour and dupatta), write details, add photos, press </w:t>
             </w:r>
             <w:r>
               <w:rPr>
@@ -1512,7 +1633,7 @@
       </w:pPr>
       <w:r>
         <w:rPr/>
-        <w:t>Name, necklines and details</w:t>
+        <w:t>Name, what it goes with, and details</w:t>
       </w:r>
     </w:p>
     <w:p>
@@ -1574,11 +1695,21 @@
         <w:rPr>
           <w:b/>
         </w:rPr>
-        <w:t>Made for which necklines?</w:t>
+        <w:t>What does this embroidery go with?</w:t>
       </w:r>
       <w:r>
         <w:rPr/>
-        <w:t xml:space="preserve"> Tick each neckline this embroidery is designed for (V-Neck, Round Neck, High Neck…). In Create Your Own Design, customers only see it after picking one of these necklines. Tick none if it suits every neckline.</w:t>
+        <w:t xml:space="preserve"> Tick the choices from Create Your Own Design this embroidery is made for (see the table below). Neck type and sleeve type are required, plus a length or a lower. Colour and dupatta are optional. If something required is missing, </w:t>
+      </w:r>
+      <w:r>
+        <w:rPr>
+          <w:b/>
+        </w:rPr>
+        <w:t>Extract embroidery</w:t>
+      </w:r>
+      <w:r>
+        <w:rPr/>
+        <w:t xml:space="preserve"> stops and the box shows what to tick. Your photos are kept.</w:t>
       </w:r>
     </w:p>
     <w:p>
@@ -1618,6 +1749,410 @@
       <w:pPr>
         <w:spacing w:after="0"/>
       </w:pPr>
+    </w:p>
+    <w:tbl>
+      <w:tblPr>
+        <w:jc w:val="center"/>
+        <w:tblLayout w:type="fixed"/>
+        <w:tblLook w:firstColumn="1" w:firstRow="1" w:lastColumn="0" w:lastRow="0" w:noHBand="0" w:noVBand="1" w:val="04A0"/>
+        <w:tblW w:w="9865" w:type="dxa"/>
+        <w:tblLayout w:type="fixed"/>
+        <w:tblBorders>
+          <w:top w:val="single" w:sz="4" w:color="E6E0D6"/>
+          <w:left w:val="single" w:sz="4" w:color="E6E0D6"/>
+          <w:bottom w:val="single" w:sz="4" w:color="E6E0D6"/>
+          <w:right w:val="single" w:sz="4" w:color="E6E0D6"/>
+          <w:insideH w:val="single" w:sz="4" w:color="E6E0D6"/>
+          <w:insideV w:val="single" w:sz="4" w:color="E6E0D6"/>
+        </w:tblBorders>
+        <w:tblCellMar>
+          <w:top w:w="80" w:type="dxa"/>
+          <w:bottom w:w="80" w:type="dxa"/>
+          <w:left w:w="110" w:type="dxa"/>
+          <w:right w:w="110" w:type="dxa"/>
+        </w:tblCellMar>
+      </w:tblPr>
+      <w:tblGrid>
+        <w:gridCol w:w="3289"/>
+        <w:gridCol w:w="3289"/>
+        <w:gridCol w:w="3289"/>
+      </w:tblGrid>
+      <w:tr>
+        <w:trPr>
+          <w:tblHeader w:val="true"/>
+        </w:trPr>
+        <w:tc>
+          <w:tcPr>
+            <w:tcW w:type="dxa" w:w="1474"/>
+            <w:shd w:val="clear" w:color="auto" w:fill="FAF6F0"/>
+          </w:tcPr>
+          <w:p>
+            <w:pPr>
+              <w:spacing w:after="0"/>
+            </w:pPr>
+            <w:r>
+              <w:rPr>
+                <w:b/>
+                <w:sz w:val="18"/>
+              </w:rPr>
+              <w:t>Choice</w:t>
+            </w:r>
+          </w:p>
+        </w:tc>
+        <w:tc>
+          <w:tcPr>
+            <w:tcW w:type="dxa" w:w="1587"/>
+            <w:shd w:val="clear" w:color="auto" w:fill="FAF6F0"/>
+          </w:tcPr>
+          <w:p>
+            <w:pPr>
+              <w:spacing w:after="0"/>
+            </w:pPr>
+            <w:r>
+              <w:rPr>
+                <w:b/>
+                <w:sz w:val="18"/>
+              </w:rPr>
+              <w:t>Needed?</w:t>
+            </w:r>
+          </w:p>
+        </w:tc>
+        <w:tc>
+          <w:tcPr>
+            <w:tcW w:type="dxa" w:w="6803"/>
+            <w:shd w:val="clear" w:color="auto" w:fill="FAF6F0"/>
+          </w:tcPr>
+          <w:p>
+            <w:pPr>
+              <w:spacing w:after="0"/>
+            </w:pPr>
+            <w:r>
+              <w:rPr>
+                <w:b/>
+                <w:sz w:val="18"/>
+              </w:rPr>
+              <w:t>What it does on the website</w:t>
+            </w:r>
+          </w:p>
+        </w:tc>
+      </w:tr>
+      <w:tr>
+        <w:tc>
+          <w:tcPr>
+            <w:tcW w:type="dxa" w:w="1474"/>
+          </w:tcPr>
+          <w:p>
+            <w:pPr>
+              <w:spacing w:after="0"/>
+            </w:pPr>
+            <w:r>
+              <w:rPr>
+                <w:b/>
+                <w:sz w:val="18"/>
+              </w:rPr>
+              <w:t>Colour</w:t>
+            </w:r>
+          </w:p>
+        </w:tc>
+        <w:tc>
+          <w:tcPr>
+            <w:tcW w:type="dxa" w:w="1587"/>
+          </w:tcPr>
+          <w:p>
+            <w:pPr>
+              <w:spacing w:after="0"/>
+            </w:pPr>
+            <w:r>
+              <w:rPr>
+                <w:sz w:val="18"/>
+              </w:rPr>
+              <w:t>Optional</w:t>
+            </w:r>
+          </w:p>
+        </w:tc>
+        <w:tc>
+          <w:tcPr>
+            <w:tcW w:type="dxa" w:w="6803"/>
+          </w:tcPr>
+          <w:p>
+            <w:pPr>
+              <w:spacing w:after="0"/>
+            </w:pPr>
+            <w:r>
+              <w:rPr>
+                <w:sz w:val="18"/>
+              </w:rPr>
+              <w:t>The embroidery shows only for these colours. Tick none and it shows for every colour.</w:t>
+            </w:r>
+          </w:p>
+        </w:tc>
+      </w:tr>
+      <w:tr>
+        <w:tc>
+          <w:tcPr>
+            <w:tcW w:type="dxa" w:w="1474"/>
+          </w:tcPr>
+          <w:p>
+            <w:pPr>
+              <w:spacing w:after="0"/>
+            </w:pPr>
+            <w:r>
+              <w:rPr>
+                <w:b/>
+                <w:sz w:val="18"/>
+              </w:rPr>
+              <w:t>Neck type</w:t>
+            </w:r>
+          </w:p>
+        </w:tc>
+        <w:tc>
+          <w:tcPr>
+            <w:tcW w:type="dxa" w:w="1587"/>
+          </w:tcPr>
+          <w:p>
+            <w:pPr>
+              <w:spacing w:after="0"/>
+            </w:pPr>
+            <w:r>
+              <w:rPr>
+                <w:sz w:val="18"/>
+              </w:rPr>
+              <w:t>Required</w:t>
+            </w:r>
+          </w:p>
+        </w:tc>
+        <w:tc>
+          <w:tcPr>
+            <w:tcW w:type="dxa" w:w="6803"/>
+          </w:tcPr>
+          <w:p>
+            <w:pPr>
+              <w:spacing w:after="0"/>
+            </w:pPr>
+            <w:r>
+              <w:rPr>
+                <w:sz w:val="18"/>
+              </w:rPr>
+              <w:t>The embroidery shows only after the customer picks one of these necks. A V-neck embroidery only shows for a V-neck.</w:t>
+            </w:r>
+          </w:p>
+        </w:tc>
+      </w:tr>
+      <w:tr>
+        <w:tc>
+          <w:tcPr>
+            <w:tcW w:type="dxa" w:w="1474"/>
+          </w:tcPr>
+          <w:p>
+            <w:pPr>
+              <w:spacing w:after="0"/>
+            </w:pPr>
+            <w:r>
+              <w:rPr>
+                <w:b/>
+                <w:sz w:val="18"/>
+              </w:rPr>
+              <w:t>Sleeve type</w:t>
+            </w:r>
+          </w:p>
+        </w:tc>
+        <w:tc>
+          <w:tcPr>
+            <w:tcW w:type="dxa" w:w="1587"/>
+          </w:tcPr>
+          <w:p>
+            <w:pPr>
+              <w:spacing w:after="0"/>
+            </w:pPr>
+            <w:r>
+              <w:rPr>
+                <w:sz w:val="18"/>
+              </w:rPr>
+              <w:t>Required</w:t>
+            </w:r>
+          </w:p>
+        </w:tc>
+        <w:tc>
+          <w:tcPr>
+            <w:tcW w:type="dxa" w:w="6803"/>
+          </w:tcPr>
+          <w:p>
+            <w:pPr>
+              <w:spacing w:after="0"/>
+            </w:pPr>
+            <w:r>
+              <w:rPr>
+                <w:sz w:val="18"/>
+              </w:rPr>
+              <w:t>Once the customer picks this embroidery, the Sleeve step offers only these sleeves.</w:t>
+            </w:r>
+          </w:p>
+        </w:tc>
+      </w:tr>
+      <w:tr>
+        <w:tc>
+          <w:tcPr>
+            <w:tcW w:type="dxa" w:w="1474"/>
+          </w:tcPr>
+          <w:p>
+            <w:pPr>
+              <w:spacing w:after="0"/>
+            </w:pPr>
+            <w:r>
+              <w:rPr>
+                <w:b/>
+                <w:sz w:val="18"/>
+              </w:rPr>
+              <w:t>Length</w:t>
+            </w:r>
+          </w:p>
+        </w:tc>
+        <w:tc>
+          <w:tcPr>
+            <w:tcW w:type="dxa" w:w="1587"/>
+          </w:tcPr>
+          <w:p>
+            <w:pPr>
+              <w:spacing w:after="0"/>
+            </w:pPr>
+            <w:r>
+              <w:rPr>
+                <w:sz w:val="18"/>
+              </w:rPr>
+              <w:t>Length or Lower</w:t>
+            </w:r>
+          </w:p>
+        </w:tc>
+        <w:tc>
+          <w:tcPr>
+            <w:tcW w:type="dxa" w:w="6803"/>
+          </w:tcPr>
+          <w:p>
+            <w:pPr>
+              <w:spacing w:after="0"/>
+            </w:pPr>
+            <w:r>
+              <w:rPr>
+                <w:sz w:val="18"/>
+              </w:rPr>
+              <w:t>For kurti and anarkali. Once picked, the Length step offers only these.</w:t>
+            </w:r>
+          </w:p>
+        </w:tc>
+      </w:tr>
+      <w:tr>
+        <w:tc>
+          <w:tcPr>
+            <w:tcW w:type="dxa" w:w="1474"/>
+          </w:tcPr>
+          <w:p>
+            <w:pPr>
+              <w:spacing w:after="0"/>
+            </w:pPr>
+            <w:r>
+              <w:rPr>
+                <w:b/>
+                <w:sz w:val="18"/>
+              </w:rPr>
+              <w:t>Lower</w:t>
+            </w:r>
+          </w:p>
+        </w:tc>
+        <w:tc>
+          <w:tcPr>
+            <w:tcW w:type="dxa" w:w="1587"/>
+          </w:tcPr>
+          <w:p>
+            <w:pPr>
+              <w:spacing w:after="0"/>
+            </w:pPr>
+            <w:r>
+              <w:rPr>
+                <w:sz w:val="18"/>
+              </w:rPr>
+              <w:t>Length or Lower</w:t>
+            </w:r>
+          </w:p>
+        </w:tc>
+        <w:tc>
+          <w:tcPr>
+            <w:tcW w:type="dxa" w:w="6803"/>
+          </w:tcPr>
+          <w:p>
+            <w:pPr>
+              <w:spacing w:after="0"/>
+            </w:pPr>
+            <w:r>
+              <w:rPr>
+                <w:sz w:val="18"/>
+              </w:rPr>
+              <w:t>For patiala and sharara: the salwar, pajama or sharara that goes with it, for example the one with the embroidered ankle border.</w:t>
+            </w:r>
+          </w:p>
+        </w:tc>
+      </w:tr>
+      <w:tr>
+        <w:tc>
+          <w:tcPr>
+            <w:tcW w:type="dxa" w:w="1474"/>
+          </w:tcPr>
+          <w:p>
+            <w:pPr>
+              <w:spacing w:after="0"/>
+            </w:pPr>
+            <w:r>
+              <w:rPr>
+                <w:b/>
+                <w:sz w:val="18"/>
+              </w:rPr>
+              <w:t>Dupatta</w:t>
+            </w:r>
+          </w:p>
+        </w:tc>
+        <w:tc>
+          <w:tcPr>
+            <w:tcW w:type="dxa" w:w="1587"/>
+          </w:tcPr>
+          <w:p>
+            <w:pPr>
+              <w:spacing w:after="0"/>
+            </w:pPr>
+            <w:r>
+              <w:rPr>
+                <w:sz w:val="18"/>
+              </w:rPr>
+              <w:t>Optional</w:t>
+            </w:r>
+          </w:p>
+        </w:tc>
+        <w:tc>
+          <w:tcPr>
+            <w:tcW w:type="dxa" w:w="6803"/>
+          </w:tcPr>
+          <w:p>
+            <w:pPr>
+              <w:spacing w:after="0"/>
+            </w:pPr>
+            <w:r>
+              <w:rPr>
+                <w:sz w:val="18"/>
+              </w:rPr>
+              <w:t>Once picked, the Dupatta step offers only these. Tick none for any dupatta.</w:t>
+            </w:r>
+          </w:p>
+        </w:tc>
+      </w:tr>
+    </w:tbl>
+    <w:p>
+      <w:pPr>
+        <w:spacing w:after="40"/>
+      </w:pPr>
+    </w:p>
+    <w:p>
+      <w:r>
+        <w:rPr/>
+        <w:t>Tick both a length and a lower if the embroidery suits every garment. A step can have several choices ticked, for example V-Neck and Sweetheart Neck.</w:t>
+      </w:r>
     </w:p>
     <w:tbl>
       <w:tblPr>
@@ -1755,7 +2290,7 @@
     <w:p>
       <w:r>
         <w:rPr/>
-        <w:t>There are six photo boxes. Each one shows a small drawing of the part of the garment it should cover.</w:t>
+        <w:t>There are seven photo boxes. Each one shows a small drawing of the part of the garment it should cover.</w:t>
       </w:r>
     </w:p>
     <w:tbl>
@@ -2032,6 +2567,41 @@
                 <w:b/>
                 <w:sz w:val="18"/>
               </w:rPr>
+              <w:t>Lower (salwar / pajama)</w:t>
+            </w:r>
+          </w:p>
+        </w:tc>
+        <w:tc>
+          <w:tcPr>
+            <w:tcW w:type="dxa" w:w="6350"/>
+          </w:tcPr>
+          <w:p>
+            <w:pPr>
+              <w:spacing w:after="0"/>
+            </w:pPr>
+            <w:r>
+              <w:rPr>
+                <w:sz w:val="18"/>
+              </w:rPr>
+              <w:t>Only if the lower has embroidery, for example an ankle border. That work is extracted too, as its own pieces.</w:t>
+            </w:r>
+          </w:p>
+        </w:tc>
+      </w:tr>
+      <w:tr>
+        <w:tc>
+          <w:tcPr>
+            <w:tcW w:type="dxa" w:w="3515"/>
+          </w:tcPr>
+          <w:p>
+            <w:pPr>
+              <w:spacing w:after="0"/>
+            </w:pPr>
+            <w:r>
+              <w:rPr>
+                <w:b/>
+                <w:sz w:val="18"/>
+              </w:rPr>
               <w:t>Back</w:t>
             </w:r>
           </w:p>
@@ -2068,7 +2638,7 @@
       </w:r>
       <w:r>
         <w:rPr/>
-        <w:t xml:space="preserve"> After the six boxes there is an </w:t>
+        <w:t xml:space="preserve"> After the seven boxes there is an </w:t>
       </w:r>
       <w:r>
         <w:rPr>
@@ -2078,7 +2648,7 @@
       </w:r>
       <w:r>
         <w:rPr/>
-        <w:t xml:space="preserve"> tile with a + sign. Use it for any detail the six boxes miss: a cuff from closer, a motif, a second border. You can add up to six more. Under each one, write what it shows, for example </w:t>
+        <w:t xml:space="preserve"> tile with a + sign. Use it for any detail the seven boxes miss: a cuff from closer, a motif, a second border. You can add up to five more (12 photos in all). Under each one, write what it shows, for example </w:t>
       </w:r>
       <w:r>
         <w:rPr>
@@ -2265,11 +2835,6 @@
       <w:pPr>
         <w:spacing w:after="40"/>
       </w:pPr>
-    </w:p>
-    <w:p>
-      <w:r>
-        <w:br w:type="page"/>
-      </w:r>
     </w:p>
     <w:p>
       <w:pPr>
@@ -2431,7 +2996,20 @@
               <w:rPr>
                 <w:sz w:val="18"/>
               </w:rPr>
-              <w:t>Where it belongs: neckline, yoke, placket, shoulder, chest, sleeve, sleeve cuff, waist, buti (small repeated motif), hem border, lower border or back.</w:t>
+              <w:t xml:space="preserve">Where it belongs: neckline, yoke, placket, shoulder, chest, sleeve, sleeve cuff, waist, buti (small repeated motif), hem border, lower border, </w:t>
+            </w:r>
+            <w:r>
+              <w:rPr>
+                <w:b/>
+                <w:sz w:val="18"/>
+              </w:rPr>
+              <w:t>lower (salwar, pajama)</w:t>
+            </w:r>
+            <w:r>
+              <w:rPr>
+                <w:sz w:val="18"/>
+              </w:rPr>
+              <w:t xml:space="preserve"> for work on the bottom wear, or back.</w:t>
             </w:r>
           </w:p>
         </w:tc>
@@ -2774,17 +3352,27 @@
     <w:p>
       <w:r>
         <w:rPr/>
-        <w:t xml:space="preserve">At the top of step 2 you can see the embroidery’s </w:t>
+        <w:t xml:space="preserve">At the top of step 2 you can see what the embroidery </w:t>
       </w:r>
       <w:r>
         <w:rPr>
           <w:b/>
         </w:rPr>
-        <w:t>Necklines</w:t>
+        <w:t>Goes with</w:t>
       </w:r>
       <w:r>
         <w:rPr/>
-        <w:t xml:space="preserve"> and </w:t>
+        <w:t xml:space="preserve"> (for example </w:t>
+      </w:r>
+      <w:r>
+        <w:rPr>
+          <w:i/>
+        </w:rPr>
+        <w:t>Red · V-Neck · Full Sleeve · Salwar</w:t>
+      </w:r>
+      <w:r>
+        <w:rPr/>
+        <w:t xml:space="preserve">) and its </w:t>
       </w:r>
       <w:r>
         <w:rPr>
@@ -2883,7 +3471,7 @@
       </w:r>
       <w:r>
         <w:rPr/>
-        <w:t xml:space="preserve"> of the embroidered garment.</w:t>
+        <w:t xml:space="preserve"> of the embroidered garment. Pieces on the lower (salwar, pajama) are only placed when this is ticked.</w:t>
       </w:r>
     </w:p>
     <w:p>
@@ -3098,11 +3686,6 @@
       <w:pPr>
         <w:spacing w:after="40"/>
       </w:pPr>
-    </w:p>
-    <w:p>
-      <w:r>
-        <w:br w:type="page"/>
-      </w:r>
     </w:p>
     <w:p>
       <w:pPr>
@@ -3435,7 +4018,7 @@
       </w:r>
       <w:r>
         <w:rPr/>
-        <w:t>Customers see each embroidery only after choosing one of its necklines (see step 1).</w:t>
+        <w:t>Customers see each embroidery only for the colours and necks it goes with (see step 1). After they pick it, the Sleeve, Length, Lower and Dupatta steps offer only the choices you ticked, so nothing clashes. If they go back and change the neck, an embroidery that no longer fits is cleared and they choose again.</w:t>
       </w:r>
     </w:p>
     <w:p>
@@ -3540,7 +4123,7 @@
       </w:r>
       <w:r>
         <w:rPr/>
-        <w:t xml:space="preserve">: change the name, the necklines and the details for the AI, then press </w:t>
+        <w:t xml:space="preserve">: change the name, what it goes with and the details for the AI, then press </w:t>
       </w:r>
       <w:r>
         <w:rPr>
@@ -3550,7 +4133,34 @@
       </w:r>
       <w:r>
         <w:rPr/>
-        <w:t>. New necklines take effect in Create Your Own Design straight away.</w:t>
+        <w:t>. Changes take effect in Create Your Own Design straight away.</w:t>
+      </w:r>
+    </w:p>
+    <w:p>
+      <w:pPr>
+        <w:tabs>
+          <w:tab w:pos="369" w:val="left"/>
+        </w:tabs>
+        <w:spacing w:after="60"/>
+        <w:ind w:left="369" w:hanging="283"/>
+      </w:pPr>
+      <w:r>
+        <w:t>•</w:t>
+        <w:tab/>
+      </w:r>
+      <w:r>
+        <w:rPr/>
+        <w:t xml:space="preserve">Embroidery saved before sleeve, length and lower existed shows </w:t>
+      </w:r>
+      <w:r>
+        <w:rPr>
+          <w:i/>
+        </w:rPr>
+        <w:t>details missing</w:t>
+      </w:r>
+      <w:r>
+        <w:rPr/>
+        <w:t xml:space="preserve"> on its card. Open the pencil, tick its sleeve and length or lower, and save; until then it shows with every sleeve and lower.</w:t>
       </w:r>
     </w:p>
     <w:p>
@@ -4525,7 +5135,41 @@
               <w:rPr>
                 <w:sz w:val="18"/>
               </w:rPr>
-              <w:t>Check it is shown under Show in the designer, has approved pieces, and that the customer picked one of its necklines.</w:t>
+              <w:t>Check it is shown under Show in the designer, has approved pieces, and that the customer picked one of its colours (if you ticked any) and one of its necks.</w:t>
+            </w:r>
+          </w:p>
+        </w:tc>
+      </w:tr>
+      <w:tr>
+        <w:tc>
+          <w:tcPr>
+            <w:tcW w:type="dxa" w:w="3118"/>
+          </w:tcPr>
+          <w:p>
+            <w:pPr>
+              <w:spacing w:after="0"/>
+            </w:pPr>
+            <w:r>
+              <w:rPr>
+                <w:sz w:val="18"/>
+              </w:rPr>
+              <w:t>A sleeve or lower is missing in the designer.</w:t>
+            </w:r>
+          </w:p>
+        </w:tc>
+        <w:tc>
+          <w:tcPr>
+            <w:tcW w:type="dxa" w:w="6746"/>
+          </w:tcPr>
+          <w:p>
+            <w:pPr>
+              <w:spacing w:after="0"/>
+            </w:pPr>
+            <w:r>
+              <w:rPr>
+                <w:sz w:val="18"/>
+              </w:rPr>
+              <w:t>The customer picked an embroidery that only goes with other sleeves or lowers. Tick more of them on that embroidery, or the customer picks another embroidery.</w:t>
             </w:r>
           </w:p>
         </w:tc>
@@ -4649,16 +5293,7 @@
     <w:p>
       <w:r>
         <w:rPr/>
-        <w:t>Each card is a garment customers can design, for example Patiala Suit, Kurti, Anarkali Suit or Sharara Set. Click one to edit it.</w:t>
-      </w:r>
-    </w:p>
-    <w:p>
-      <w:pPr>
-        <w:pStyle w:val="Heading3"/>
-      </w:pPr>
-      <w:r>
-        <w:rPr/>
-        <w:t>Details</w:t>
+        <w:t>Each card is a garment customers can design, for example Patiala Suit, Kurti, Anarkali Suit or Sharara Set. Click one to edit it below the cards.</w:t>
       </w:r>
     </w:p>
     <w:p>
@@ -4674,34 +5309,28 @@
         <w:tab/>
       </w:r>
       <w:r>
+        <w:rPr/>
+        <w:t xml:space="preserve">Hover over a card (on a phone the buttons are always shown) for a </w:t>
+      </w:r>
+      <w:r>
         <w:rPr>
           <w:b/>
         </w:rPr>
-        <w:t>Garment name</w:t>
+        <w:t>pencil</w:t>
       </w:r>
       <w:r>
         <w:rPr/>
-        <w:t xml:space="preserve">, </w:t>
+        <w:t xml:space="preserve"> and a </w:t>
       </w:r>
       <w:r>
         <w:rPr>
           <w:b/>
         </w:rPr>
-        <w:t>Description</w:t>
+        <w:t>bin</w:t>
       </w:r>
       <w:r>
         <w:rPr/>
-        <w:t xml:space="preserve"> and </w:t>
-      </w:r>
-      <w:r>
-        <w:rPr>
-          <w:b/>
-        </w:rPr>
-        <w:t>Collection</w:t>
-      </w:r>
-      <w:r>
-        <w:rPr/>
-        <w:t xml:space="preserve"> (Indian, Western or Indo-western).</w:t>
+        <w:t>.</w:t>
       </w:r>
     </w:p>
     <w:p>
@@ -4717,14 +5346,18 @@
         <w:tab/>
       </w:r>
       <w:r>
+        <w:rPr/>
+        <w:t xml:space="preserve">The </w:t>
+      </w:r>
+      <w:r>
         <w:rPr>
           <w:b/>
         </w:rPr>
-        <w:t>Starting price</w:t>
+        <w:t>pencil</w:t>
       </w:r>
       <w:r>
         <w:rPr/>
-        <w:t>: the base price. Options add to this.</w:t>
+        <w:t xml:space="preserve"> opens that garment’s editor and scrolls to it.</w:t>
       </w:r>
     </w:p>
     <w:p>
@@ -4740,14 +5373,18 @@
         <w:tab/>
       </w:r>
       <w:r>
+        <w:rPr/>
+        <w:t xml:space="preserve">The </w:t>
+      </w:r>
+      <w:r>
         <w:rPr>
           <w:b/>
         </w:rPr>
-        <w:t>Display order</w:t>
+        <w:t>bin</w:t>
       </w:r>
       <w:r>
         <w:rPr/>
-        <w:t>: lower numbers show first.</w:t>
+        <w:t xml:space="preserve"> deletes the garment after you confirm. It disappears from the Design Builder and the website. Saved designs and orders keep their copy.</w:t>
       </w:r>
     </w:p>
     <w:p>
@@ -4766,220 +5403,11 @@
         <w:rPr>
           <w:b/>
         </w:rPr>
-        <w:t>Visible on the website</w:t>
+        <w:t>New garment</w:t>
       </w:r>
       <w:r>
         <w:rPr/>
-        <w:t>: hidden garments stay saved but customers can’t pick them.</w:t>
-      </w:r>
-    </w:p>
-    <w:p>
-      <w:pPr>
-        <w:spacing w:after="0"/>
-      </w:pPr>
-    </w:p>
-    <w:p>
-      <w:pPr>
-        <w:pStyle w:val="Heading3"/>
-      </w:pPr>
-      <w:r>
-        <w:rPr/>
-        <w:t>Pictures</w:t>
-      </w:r>
-    </w:p>
-    <w:p>
-      <w:pPr>
-        <w:tabs>
-          <w:tab w:pos="369" w:val="left"/>
-        </w:tabs>
-        <w:spacing w:after="60"/>
-        <w:ind w:left="369" w:hanging="283"/>
-      </w:pPr>
-      <w:r>
-        <w:t>•</w:t>
-        <w:tab/>
-      </w:r>
-      <w:r>
-        <w:rPr>
-          <w:b/>
-        </w:rPr>
-        <w:t>Card</w:t>
-      </w:r>
-      <w:r>
-        <w:rPr/>
-        <w:t>: the picture on the garment card.</w:t>
-      </w:r>
-    </w:p>
-    <w:p>
-      <w:pPr>
-        <w:tabs>
-          <w:tab w:pos="369" w:val="left"/>
-        </w:tabs>
-        <w:spacing w:after="60"/>
-        <w:ind w:left="369" w:hanging="283"/>
-      </w:pPr>
-      <w:r>
-        <w:t>•</w:t>
-        <w:tab/>
-      </w:r>
-      <w:r>
-        <w:rPr>
-          <w:b/>
-        </w:rPr>
-        <w:t>Builder preview</w:t>
-      </w:r>
-      <w:r>
-        <w:rPr/>
-        <w:t>: the photo shown while the customer designs. The AI preview edits this photo.</w:t>
-      </w:r>
-    </w:p>
-    <w:p>
-      <w:pPr>
-        <w:tabs>
-          <w:tab w:pos="369" w:val="left"/>
-        </w:tabs>
-        <w:spacing w:after="60"/>
-        <w:ind w:left="369" w:hanging="283"/>
-      </w:pPr>
-      <w:r>
-        <w:t>•</w:t>
-        <w:tab/>
-      </w:r>
-      <w:r>
-        <w:rPr/>
-        <w:t>Click a picture tile to upload, or drag a picture onto it.</w:t>
-      </w:r>
-    </w:p>
-    <w:p>
-      <w:pPr>
-        <w:spacing w:after="0"/>
-      </w:pPr>
-    </w:p>
-    <w:p>
-      <w:pPr>
-        <w:pStyle w:val="Heading3"/>
-      </w:pPr>
-      <w:r>
-        <w:rPr/>
-        <w:t>Steps in the builder</w:t>
-      </w:r>
-    </w:p>
-    <w:p>
-      <w:r>
-        <w:rPr/>
-        <w:t>The steps a customer goes through for this garment, in order.</w:t>
-      </w:r>
-    </w:p>
-    <w:p>
-      <w:pPr>
-        <w:tabs>
-          <w:tab w:pos="369" w:val="left"/>
-        </w:tabs>
-        <w:spacing w:after="60"/>
-        <w:ind w:left="369" w:hanging="283"/>
-      </w:pPr>
-      <w:r>
-        <w:t>•</w:t>
-        <w:tab/>
-      </w:r>
-      <w:r>
-        <w:rPr>
-          <w:b/>
-        </w:rPr>
-        <w:t>Move up</w:t>
-      </w:r>
-      <w:r>
-        <w:rPr/>
-        <w:t xml:space="preserve"> / </w:t>
-      </w:r>
-      <w:r>
-        <w:rPr>
-          <w:b/>
-        </w:rPr>
-        <w:t>Move down</w:t>
-      </w:r>
-      <w:r>
-        <w:rPr/>
-        <w:t xml:space="preserve"> to reorder, </w:t>
-      </w:r>
-      <w:r>
-        <w:rPr>
-          <w:b/>
-        </w:rPr>
-        <w:t>Remove step</w:t>
-      </w:r>
-      <w:r>
-        <w:rPr/>
-        <w:t xml:space="preserve"> to take one away.</w:t>
-      </w:r>
-    </w:p>
-    <w:p>
-      <w:pPr>
-        <w:tabs>
-          <w:tab w:pos="369" w:val="left"/>
-        </w:tabs>
-        <w:spacing w:after="60"/>
-        <w:ind w:left="369" w:hanging="283"/>
-      </w:pPr>
-      <w:r>
-        <w:t>•</w:t>
-        <w:tab/>
-      </w:r>
-      <w:r>
-        <w:rPr>
-          <w:b/>
-        </w:rPr>
-        <w:t>Options offered</w:t>
-      </w:r>
-      <w:r>
-        <w:rPr/>
-        <w:t>: tick which options this garment offers. Nothing ticked means every active option of the step is offered, including ones added later.</w:t>
-      </w:r>
-    </w:p>
-    <w:p>
-      <w:pPr>
-        <w:tabs>
-          <w:tab w:pos="369" w:val="left"/>
-        </w:tabs>
-        <w:spacing w:after="60"/>
-        <w:ind w:left="369" w:hanging="283"/>
-      </w:pPr>
-      <w:r>
-        <w:t>•</w:t>
-        <w:tab/>
-      </w:r>
-      <w:r>
-        <w:rPr>
-          <w:b/>
-        </w:rPr>
-        <w:t>Pre-selected option</w:t>
-      </w:r>
-      <w:r>
-        <w:rPr/>
-        <w:t>: the choice already selected when the customer arrives.</w:t>
-      </w:r>
-    </w:p>
-    <w:p>
-      <w:pPr>
-        <w:tabs>
-          <w:tab w:pos="369" w:val="left"/>
-        </w:tabs>
-        <w:spacing w:after="60"/>
-        <w:ind w:left="369" w:hanging="283"/>
-      </w:pPr>
-      <w:r>
-        <w:t>•</w:t>
-        <w:tab/>
-      </w:r>
-      <w:r>
-        <w:rPr>
-          <w:b/>
-        </w:rPr>
-        <w:t>Only show this step when</w:t>
-      </w:r>
-      <w:r>
-        <w:rPr/>
-        <w:t>: for example show Cuff only when Sleeve is Full Sleeve.</w:t>
+        <w:t>, the last tile, adds one: type its name and starting price, then set it up below.</w:t>
       </w:r>
     </w:p>
     <w:p>
@@ -5023,7 +5451,7 @@
                 <w:b/>
                 <w:color w:val="8A5A00"/>
               </w:rPr>
-              <w:t>Keep Neck before Embroidery</w:t>
+              <w:t>Starting fresh with your own garments</w:t>
             </w:r>
           </w:p>
           <w:p>
@@ -5034,7 +5462,33 @@
               <w:rPr>
                 <w:sz w:val="19"/>
               </w:rPr>
-              <w:t>Embroidery is filtered by neckline. Make sure the Neck step comes before the Embroidery step for every garment, so customers pick the neckline first.</w:t>
+              <w:t xml:space="preserve">The four garments there now (Patiala Suit, Kurti, Anarkali Suit, Sharara Set) were set up for testing. To replace them, delete each with the bin, then add your own with </w:t>
+            </w:r>
+            <w:r>
+              <w:rPr>
+                <w:b/>
+                <w:sz w:val="19"/>
+              </w:rPr>
+              <w:t>New garment</w:t>
+            </w:r>
+            <w:r>
+              <w:rPr>
+                <w:sz w:val="19"/>
+              </w:rPr>
+              <w:t xml:space="preserve">: details, pictures, the steps in the builder and the measurements asked for. Steps and options under </w:t>
+            </w:r>
+            <w:r>
+              <w:rPr>
+                <w:b/>
+                <w:sz w:val="19"/>
+              </w:rPr>
+              <w:t>Steps &amp; options</w:t>
+            </w:r>
+            <w:r>
+              <w:rPr>
+                <w:sz w:val="19"/>
+              </w:rPr>
+              <w:t xml:space="preserve"> are shared by all garments and are not deleted with a garment.</w:t>
             </w:r>
           </w:p>
         </w:tc>
@@ -5051,48 +5505,7 @@
       </w:pPr>
       <w:r>
         <w:rPr/>
-        <w:t>Measurements asked for</w:t>
-      </w:r>
-    </w:p>
-    <w:p>
-      <w:r>
-        <w:rPr/>
-        <w:t xml:space="preserve">Tick which measurement fields this garment needs. The fields themselves are set up under </w:t>
-      </w:r>
-      <w:r>
-        <w:rPr>
-          <w:b/>
-        </w:rPr>
-        <w:t>Measurement fields</w:t>
-      </w:r>
-      <w:r>
-        <w:rPr/>
-        <w:t xml:space="preserve"> (section 5).</w:t>
-      </w:r>
-    </w:p>
-    <w:p>
-      <w:pPr>
-        <w:pStyle w:val="Heading2"/>
-      </w:pPr>
-      <w:r>
-        <w:rPr/>
-        <w:t>Tab 2: Steps &amp; options</w:t>
-      </w:r>
-    </w:p>
-    <w:p>
-      <w:r>
-        <w:rPr/>
-        <w:t xml:space="preserve">On the left is every step (Neck Type, Embroidery, Sleeve Type, Lower, Dupatta, Length, Size…) with its number of options. Click a step to edit it. </w:t>
-      </w:r>
-      <w:r>
-        <w:rPr>
-          <w:b/>
-        </w:rPr>
-        <w:t>New step</w:t>
-      </w:r>
-      <w:r>
-        <w:rPr/>
-        <w:t xml:space="preserve"> adds one; then add it to a garment under Garments › Steps in the builder.</w:t>
+        <w:t>Details</w:t>
       </w:r>
     </w:p>
     <w:p>
@@ -5111,31 +5524,31 @@
         <w:rPr>
           <w:b/>
         </w:rPr>
-        <w:t>Title shown to customers</w:t>
+        <w:t>Garment name</w:t>
       </w:r>
       <w:r>
         <w:rPr/>
-        <w:t xml:space="preserve"> and </w:t>
+        <w:t xml:space="preserve">, </w:t>
       </w:r>
       <w:r>
         <w:rPr>
           <w:b/>
         </w:rPr>
-        <w:t>Help text</w:t>
+        <w:t>Description</w:t>
       </w:r>
       <w:r>
         <w:rPr/>
-        <w:t xml:space="preserve"> for the step, then </w:t>
+        <w:t xml:space="preserve"> and </w:t>
       </w:r>
       <w:r>
         <w:rPr>
           <w:b/>
         </w:rPr>
-        <w:t>Save step</w:t>
+        <w:t>Collection</w:t>
       </w:r>
       <w:r>
         <w:rPr/>
-        <w:t>.</w:t>
+        <w:t xml:space="preserve"> (Indian, Western or Indo-western).</w:t>
       </w:r>
     </w:p>
     <w:p>
@@ -5151,8 +5564,14 @@
         <w:tab/>
       </w:r>
       <w:r>
+        <w:rPr>
+          <w:b/>
+        </w:rPr>
+        <w:t>Starting price</w:t>
+      </w:r>
+      <w:r>
         <w:rPr/>
-        <w:t>Each option shows its picture, price and buttons. Click the picture to upload or replace it.</w:t>
+        <w:t>: the base price. Options add to this.</w:t>
       </w:r>
     </w:p>
     <w:p>
@@ -5168,18 +5587,14 @@
         <w:tab/>
       </w:r>
       <w:r>
-        <w:rPr/>
-        <w:t xml:space="preserve">Options linked to AI Studio embroidery show the AI Studio picture and an </w:t>
-      </w:r>
-      <w:r>
         <w:rPr>
           <w:b/>
         </w:rPr>
-        <w:t>AI Studio</w:t>
+        <w:t>Display order</w:t>
       </w:r>
       <w:r>
         <w:rPr/>
-        <w:t xml:space="preserve"> badge instead of an upload box.</w:t>
+        <w:t>: lower numbers show first.</w:t>
       </w:r>
     </w:p>
     <w:p>
@@ -5198,11 +5613,25 @@
         <w:rPr>
           <w:b/>
         </w:rPr>
-        <w:t>Delete</w:t>
+        <w:t>Visible on the website</w:t>
       </w:r>
       <w:r>
         <w:rPr/>
-        <w:t xml:space="preserve"> removes an option from every garment (you are asked to confirm). Saved designs keep their copy.</w:t>
+        <w:t>: hidden garments stay saved but customers can’t pick them.</w:t>
+      </w:r>
+    </w:p>
+    <w:p>
+      <w:pPr>
+        <w:spacing w:after="0"/>
+      </w:pPr>
+    </w:p>
+    <w:p>
+      <w:pPr>
+        <w:pStyle w:val="Heading3"/>
+      </w:pPr>
+      <w:r>
+        <w:rPr/>
+        <w:t>Pictures</w:t>
       </w:r>
     </w:p>
     <w:p>
@@ -5221,31 +5650,11 @@
         <w:rPr>
           <w:b/>
         </w:rPr>
-        <w:t>Edit</w:t>
+        <w:t>Card</w:t>
       </w:r>
       <w:r>
         <w:rPr/>
-        <w:t xml:space="preserve"> opens: Name, Adds to price, Description, Display order, </w:t>
-      </w:r>
-      <w:r>
-        <w:rPr>
-          <w:b/>
-        </w:rPr>
-        <w:t>Visible to customers</w:t>
-      </w:r>
-      <w:r>
-        <w:rPr/>
-        <w:t xml:space="preserve">, and </w:t>
-      </w:r>
-      <w:r>
-        <w:rPr>
-          <w:b/>
-        </w:rPr>
-        <w:t>Only offer with</w:t>
-      </w:r>
-      <w:r>
-        <w:rPr/>
-        <w:t>.</w:t>
+        <w:t>: the picture on the garment card.</w:t>
       </w:r>
     </w:p>
     <w:p>
@@ -5264,11 +5673,459 @@
         <w:rPr>
           <w:b/>
         </w:rPr>
+        <w:t>Builder preview</w:t>
+      </w:r>
+      <w:r>
+        <w:rPr/>
+        <w:t>: the photo shown while the customer designs. The AI preview edits this photo.</w:t>
+      </w:r>
+    </w:p>
+    <w:p>
+      <w:pPr>
+        <w:tabs>
+          <w:tab w:pos="369" w:val="left"/>
+        </w:tabs>
+        <w:spacing w:after="60"/>
+        <w:ind w:left="369" w:hanging="283"/>
+      </w:pPr>
+      <w:r>
+        <w:t>•</w:t>
+        <w:tab/>
+      </w:r>
+      <w:r>
+        <w:rPr/>
+        <w:t>Click a picture tile to upload, or drag a picture onto it.</w:t>
+      </w:r>
+    </w:p>
+    <w:p>
+      <w:pPr>
+        <w:spacing w:after="0"/>
+      </w:pPr>
+    </w:p>
+    <w:p>
+      <w:pPr>
+        <w:pStyle w:val="Heading3"/>
+      </w:pPr>
+      <w:r>
+        <w:rPr/>
+        <w:t>Steps in the builder</w:t>
+      </w:r>
+    </w:p>
+    <w:p>
+      <w:r>
+        <w:rPr/>
+        <w:t>The steps a customer goes through for this garment, in order.</w:t>
+      </w:r>
+    </w:p>
+    <w:p>
+      <w:pPr>
+        <w:tabs>
+          <w:tab w:pos="369" w:val="left"/>
+        </w:tabs>
+        <w:spacing w:after="60"/>
+        <w:ind w:left="369" w:hanging="283"/>
+      </w:pPr>
+      <w:r>
+        <w:t>•</w:t>
+        <w:tab/>
+      </w:r>
+      <w:r>
+        <w:rPr>
+          <w:b/>
+        </w:rPr>
+        <w:t>Move up</w:t>
+      </w:r>
+      <w:r>
+        <w:rPr/>
+        <w:t xml:space="preserve"> / </w:t>
+      </w:r>
+      <w:r>
+        <w:rPr>
+          <w:b/>
+        </w:rPr>
+        <w:t>Move down</w:t>
+      </w:r>
+      <w:r>
+        <w:rPr/>
+        <w:t xml:space="preserve"> to reorder, </w:t>
+      </w:r>
+      <w:r>
+        <w:rPr>
+          <w:b/>
+        </w:rPr>
+        <w:t>Remove step</w:t>
+      </w:r>
+      <w:r>
+        <w:rPr/>
+        <w:t xml:space="preserve"> to take one away.</w:t>
+      </w:r>
+    </w:p>
+    <w:p>
+      <w:pPr>
+        <w:tabs>
+          <w:tab w:pos="369" w:val="left"/>
+        </w:tabs>
+        <w:spacing w:after="60"/>
+        <w:ind w:left="369" w:hanging="283"/>
+      </w:pPr>
+      <w:r>
+        <w:t>•</w:t>
+        <w:tab/>
+      </w:r>
+      <w:r>
+        <w:rPr>
+          <w:b/>
+        </w:rPr>
+        <w:t>Options offered</w:t>
+      </w:r>
+      <w:r>
+        <w:rPr/>
+        <w:t>: tick which options this garment offers. Nothing ticked means every active option of the step is offered, including ones added later.</w:t>
+      </w:r>
+    </w:p>
+    <w:p>
+      <w:pPr>
+        <w:tabs>
+          <w:tab w:pos="369" w:val="left"/>
+        </w:tabs>
+        <w:spacing w:after="60"/>
+        <w:ind w:left="369" w:hanging="283"/>
+      </w:pPr>
+      <w:r>
+        <w:t>•</w:t>
+        <w:tab/>
+      </w:r>
+      <w:r>
+        <w:rPr>
+          <w:b/>
+        </w:rPr>
+        <w:t>Pre-selected option</w:t>
+      </w:r>
+      <w:r>
+        <w:rPr/>
+        <w:t>: the choice already selected when the customer arrives.</w:t>
+      </w:r>
+    </w:p>
+    <w:p>
+      <w:pPr>
+        <w:tabs>
+          <w:tab w:pos="369" w:val="left"/>
+        </w:tabs>
+        <w:spacing w:after="60"/>
+        <w:ind w:left="369" w:hanging="283"/>
+      </w:pPr>
+      <w:r>
+        <w:t>•</w:t>
+        <w:tab/>
+      </w:r>
+      <w:r>
+        <w:rPr>
+          <w:b/>
+        </w:rPr>
+        <w:t>Only show this step when</w:t>
+      </w:r>
+      <w:r>
+        <w:rPr/>
+        <w:t>: for example show Cuff only when Sleeve is Full Sleeve.</w:t>
+      </w:r>
+    </w:p>
+    <w:p>
+      <w:pPr>
+        <w:spacing w:after="0"/>
+      </w:pPr>
+    </w:p>
+    <w:tbl>
+      <w:tblPr>
+        <w:tblLook w:firstColumn="1" w:firstRow="1" w:lastColumn="0" w:lastRow="0" w:noHBand="0" w:noVBand="1" w:val="04A0"/>
+        <w:jc w:val="center"/>
+        <w:tblBorders>
+          <w:top w:val="nil"/>
+          <w:left w:val="nil"/>
+          <w:bottom w:val="nil"/>
+          <w:right w:val="nil"/>
+          <w:insideH w:val="nil"/>
+          <w:insideV w:val="nil"/>
+        </w:tblBorders>
+        <w:tblW w:w="9865" w:type="dxa"/>
+        <w:tblLayout w:type="fixed"/>
+        <w:tblCellMar>
+          <w:top w:w="120" w:type="dxa"/>
+          <w:bottom w:w="120" w:type="dxa"/>
+          <w:left w:w="160" w:type="dxa"/>
+          <w:right w:w="160" w:type="dxa"/>
+        </w:tblCellMar>
+      </w:tblPr>
+      <w:tblGrid>
+        <w:gridCol w:w="9866"/>
+      </w:tblGrid>
+      <w:tr>
+        <w:tc>
+          <w:tcPr>
+            <w:tcW w:type="dxa" w:w="9865"/>
+            <w:shd w:val="clear" w:color="auto" w:fill="E0F1DC"/>
+          </w:tcPr>
+          <w:p>
+            <w:r>
+              <w:rPr>
+                <w:b/>
+                <w:color w:val="2F5A2A"/>
+              </w:rPr>
+              <w:t>Step order and embroidery</w:t>
+            </w:r>
+          </w:p>
+          <w:p>
+            <w:pPr>
+              <w:spacing w:after="60"/>
+            </w:pPr>
+            <w:r>
+              <w:rPr>
+                <w:sz w:val="19"/>
+              </w:rPr>
+              <w:t>Customers see the steps in exactly the order you set here, and embroidery matching works in any order. With Embroidery after Neck (the usual order: Fabric, Colour, Neck, Embroidery, Sleeve, Lower, Dupatta, Size), the neck the customer picked decides which embroidery is offered. With Embroidery before Neck, the embroidery they picked decides which necks are offered. Steps after the embroidery always offer only what it goes with.</w:t>
+            </w:r>
+          </w:p>
+        </w:tc>
+      </w:tr>
+    </w:tbl>
+    <w:p>
+      <w:pPr>
+        <w:spacing w:after="40"/>
+      </w:pPr>
+    </w:p>
+    <w:p>
+      <w:pPr>
+        <w:pStyle w:val="Heading3"/>
+      </w:pPr>
+      <w:r>
+        <w:rPr/>
+        <w:t>Measurements asked for</w:t>
+      </w:r>
+    </w:p>
+    <w:p>
+      <w:r>
+        <w:rPr/>
+        <w:t xml:space="preserve">Tick which measurement fields this garment needs. The fields themselves are set up under </w:t>
+      </w:r>
+      <w:r>
+        <w:rPr>
+          <w:b/>
+        </w:rPr>
+        <w:t>Measurement fields</w:t>
+      </w:r>
+      <w:r>
+        <w:rPr/>
+        <w:t xml:space="preserve"> (section 5).</w:t>
+      </w:r>
+    </w:p>
+    <w:p>
+      <w:pPr>
+        <w:pStyle w:val="Heading2"/>
+      </w:pPr>
+      <w:r>
+        <w:rPr/>
+        <w:t>Tab 2: Steps &amp; options</w:t>
+      </w:r>
+    </w:p>
+    <w:p>
+      <w:r>
+        <w:rPr/>
+        <w:t xml:space="preserve">On the left is every step (Neck Type, Embroidery, Sleeve Type, Lower, Dupatta, Length, Size…) with its number of options. Click a step to edit it. </w:t>
+      </w:r>
+      <w:r>
+        <w:rPr>
+          <w:b/>
+        </w:rPr>
+        <w:t>New step</w:t>
+      </w:r>
+      <w:r>
+        <w:rPr/>
+        <w:t xml:space="preserve"> adds one; then add it to a garment under Garments › Steps in the builder.</w:t>
+      </w:r>
+    </w:p>
+    <w:p>
+      <w:pPr>
+        <w:tabs>
+          <w:tab w:pos="369" w:val="left"/>
+        </w:tabs>
+        <w:spacing w:after="60"/>
+        <w:ind w:left="369" w:hanging="283"/>
+      </w:pPr>
+      <w:r>
+        <w:t>•</w:t>
+        <w:tab/>
+      </w:r>
+      <w:r>
+        <w:rPr>
+          <w:b/>
+        </w:rPr>
+        <w:t>Title shown to customers</w:t>
+      </w:r>
+      <w:r>
+        <w:rPr/>
+        <w:t xml:space="preserve"> and </w:t>
+      </w:r>
+      <w:r>
+        <w:rPr>
+          <w:b/>
+        </w:rPr>
+        <w:t>Help text</w:t>
+      </w:r>
+      <w:r>
+        <w:rPr/>
+        <w:t xml:space="preserve"> for the step, then </w:t>
+      </w:r>
+      <w:r>
+        <w:rPr>
+          <w:b/>
+        </w:rPr>
+        <w:t>Save step</w:t>
+      </w:r>
+      <w:r>
+        <w:rPr/>
+        <w:t>.</w:t>
+      </w:r>
+    </w:p>
+    <w:p>
+      <w:pPr>
+        <w:tabs>
+          <w:tab w:pos="369" w:val="left"/>
+        </w:tabs>
+        <w:spacing w:after="60"/>
+        <w:ind w:left="369" w:hanging="283"/>
+      </w:pPr>
+      <w:r>
+        <w:t>•</w:t>
+        <w:tab/>
+      </w:r>
+      <w:r>
+        <w:rPr/>
+        <w:t>Each option shows its picture, price and buttons. Click the picture to upload or replace it.</w:t>
+      </w:r>
+    </w:p>
+    <w:p>
+      <w:pPr>
+        <w:tabs>
+          <w:tab w:pos="369" w:val="left"/>
+        </w:tabs>
+        <w:spacing w:after="60"/>
+        <w:ind w:left="369" w:hanging="283"/>
+      </w:pPr>
+      <w:r>
+        <w:t>•</w:t>
+        <w:tab/>
+      </w:r>
+      <w:r>
+        <w:rPr/>
+        <w:t xml:space="preserve">Options linked to AI Studio embroidery show the AI Studio picture and an </w:t>
+      </w:r>
+      <w:r>
+        <w:rPr>
+          <w:b/>
+        </w:rPr>
+        <w:t>AI Studio</w:t>
+      </w:r>
+      <w:r>
+        <w:rPr/>
+        <w:t xml:space="preserve"> badge instead of an upload box.</w:t>
+      </w:r>
+    </w:p>
+    <w:p>
+      <w:pPr>
+        <w:tabs>
+          <w:tab w:pos="369" w:val="left"/>
+        </w:tabs>
+        <w:spacing w:after="60"/>
+        <w:ind w:left="369" w:hanging="283"/>
+      </w:pPr>
+      <w:r>
+        <w:t>•</w:t>
+        <w:tab/>
+      </w:r>
+      <w:r>
+        <w:rPr>
+          <w:b/>
+        </w:rPr>
+        <w:t>Delete</w:t>
+      </w:r>
+      <w:r>
+        <w:rPr/>
+        <w:t xml:space="preserve"> removes an option from every garment (you are asked to confirm). Saved designs keep their copy.</w:t>
+      </w:r>
+    </w:p>
+    <w:p>
+      <w:pPr>
+        <w:tabs>
+          <w:tab w:pos="369" w:val="left"/>
+        </w:tabs>
+        <w:spacing w:after="60"/>
+        <w:ind w:left="369" w:hanging="283"/>
+      </w:pPr>
+      <w:r>
+        <w:t>•</w:t>
+        <w:tab/>
+      </w:r>
+      <w:r>
+        <w:rPr>
+          <w:b/>
+        </w:rPr>
+        <w:t>Edit</w:t>
+      </w:r>
+      <w:r>
+        <w:rPr/>
+        <w:t xml:space="preserve"> opens: Name, Adds to price, Description, Display order, </w:t>
+      </w:r>
+      <w:r>
+        <w:rPr>
+          <w:b/>
+        </w:rPr>
+        <w:t>Visible to customers</w:t>
+      </w:r>
+      <w:r>
+        <w:rPr/>
+        <w:t xml:space="preserve">, and </w:t>
+      </w:r>
+      <w:r>
+        <w:rPr>
+          <w:b/>
+        </w:rPr>
         <w:t>Only offer with</w:t>
       </w:r>
       <w:r>
         <w:rPr/>
-        <w:t>: tick options from other steps this one goes with. Nothing ticked means it goes with everything. Example: an embroidery that only suits some necklines.</w:t>
+        <w:t>.</w:t>
+      </w:r>
+    </w:p>
+    <w:p>
+      <w:pPr>
+        <w:tabs>
+          <w:tab w:pos="369" w:val="left"/>
+        </w:tabs>
+        <w:spacing w:after="60"/>
+        <w:ind w:left="369" w:hanging="283"/>
+      </w:pPr>
+      <w:r>
+        <w:t>•</w:t>
+        <w:tab/>
+      </w:r>
+      <w:r>
+        <w:rPr>
+          <w:b/>
+        </w:rPr>
+        <w:t>Only offer with</w:t>
+      </w:r>
+      <w:r>
+        <w:rPr/>
+        <w:t xml:space="preserve">: tick options from other steps this one goes with. Nothing ticked means it goes with everything. It works both ways: whichever of the two is picked first limits the other. For AI Studio embroidery, set this in AI Studio instead (its </w:t>
+      </w:r>
+      <w:r>
+        <w:rPr>
+          <w:i/>
+        </w:rPr>
+        <w:t>what it goes with</w:t>
+      </w:r>
+      <w:r>
+        <w:rPr/>
+        <w:t xml:space="preserve"> choices); AI Studio keeps those ticks up to date.</w:t>
       </w:r>
     </w:p>
     <w:p>
@@ -6518,26 +7375,7 @@
     <w:p>
       <w:r>
         <w:rPr/>
-        <w:t xml:space="preserve">The fields customers fill in when they save their measurements: Name, Unit, Help text, Default value and Order. A </w:t>
-      </w:r>
-      <w:r>
-        <w:rPr>
-          <w:b/>
-        </w:rPr>
-        <w:t>How to measure</w:t>
-      </w:r>
-      <w:r>
-        <w:rPr/>
-        <w:t xml:space="preserve"> video can be added. Tick which fields each garment needs in the Design Builder.</w:t>
-      </w:r>
-    </w:p>
-    <w:p>
-      <w:pPr>
-        <w:pStyle w:val="Heading2"/>
-      </w:pPr>
-      <w:r>
-        <w:rPr/>
-        <w:t>Newsletter</w:t>
+        <w:t>The fields customers fill in when they save their measurements for a made-to-measure garment.</w:t>
       </w:r>
     </w:p>
     <w:p>
@@ -6554,7 +7392,107 @@
       </w:r>
       <w:r>
         <w:rPr/>
-        <w:t>Everyone who signed up on the website. Search by email.</w:t>
+        <w:t xml:space="preserve">Each row is one field: </w:t>
+      </w:r>
+      <w:r>
+        <w:rPr>
+          <w:b/>
+        </w:rPr>
+        <w:t>Name</w:t>
+      </w:r>
+      <w:r>
+        <w:rPr/>
+        <w:t xml:space="preserve"> (for example </w:t>
+      </w:r>
+      <w:r>
+        <w:rPr>
+          <w:i/>
+        </w:rPr>
+        <w:t>Bust</w:t>
+      </w:r>
+      <w:r>
+        <w:rPr/>
+        <w:t xml:space="preserve">, </w:t>
+      </w:r>
+      <w:r>
+        <w:rPr>
+          <w:i/>
+        </w:rPr>
+        <w:t>Waist</w:t>
+      </w:r>
+      <w:r>
+        <w:rPr/>
+        <w:t xml:space="preserve">, </w:t>
+      </w:r>
+      <w:r>
+        <w:rPr>
+          <w:i/>
+        </w:rPr>
+        <w:t>Hip</w:t>
+      </w:r>
+      <w:r>
+        <w:rPr/>
+        <w:t xml:space="preserve">), </w:t>
+      </w:r>
+      <w:r>
+        <w:rPr>
+          <w:b/>
+        </w:rPr>
+        <w:t>Unit</w:t>
+      </w:r>
+      <w:r>
+        <w:rPr/>
+        <w:t xml:space="preserve"> (inches or cm), </w:t>
+      </w:r>
+      <w:r>
+        <w:rPr>
+          <w:b/>
+        </w:rPr>
+        <w:t>Default</w:t>
+      </w:r>
+      <w:r>
+        <w:rPr/>
+        <w:t xml:space="preserve"> value, </w:t>
+      </w:r>
+      <w:r>
+        <w:rPr>
+          <w:b/>
+        </w:rPr>
+        <w:t>Help text</w:t>
+      </w:r>
+      <w:r>
+        <w:rPr/>
+        <w:t xml:space="preserve"> that tells the customer how to measure, </w:t>
+      </w:r>
+      <w:r>
+        <w:rPr>
+          <w:b/>
+        </w:rPr>
+        <w:t>Order</w:t>
+      </w:r>
+      <w:r>
+        <w:rPr/>
+        <w:t xml:space="preserve"> (lower shows first) and </w:t>
+      </w:r>
+      <w:r>
+        <w:rPr>
+          <w:b/>
+        </w:rPr>
+        <w:t>Shown</w:t>
+      </w:r>
+      <w:r>
+        <w:rPr/>
+        <w:t xml:space="preserve">. Press </w:t>
+      </w:r>
+      <w:r>
+        <w:rPr>
+          <w:b/>
+        </w:rPr>
+        <w:t>Save</w:t>
+      </w:r>
+      <w:r>
+        <w:rPr/>
+        <w:t xml:space="preserve"> on the row after changing it.</w:t>
       </w:r>
     </w:p>
     <w:p>
@@ -6573,11 +7511,21 @@
         <w:rPr>
           <w:b/>
         </w:rPr>
-        <w:t>Export CSV</w:t>
+        <w:t>Add field</w:t>
       </w:r>
       <w:r>
         <w:rPr/>
-        <w:t xml:space="preserve"> downloads a CSV for Shopify Email or Mailchimp. Nothing is emailed from the website itself.</w:t>
+        <w:t xml:space="preserve"> at the bottom: type a name, for example </w:t>
+      </w:r>
+      <w:r>
+        <w:rPr>
+          <w:i/>
+        </w:rPr>
+        <w:t>Hip</w:t>
+      </w:r>
+      <w:r>
+        <w:rPr/>
+        <w:t>, then fill in its row.</w:t>
       </w:r>
     </w:p>
     <w:p>
@@ -6594,21 +7542,7 @@
       </w:r>
       <w:r>
         <w:rPr/>
-        <w:t>Remove someone with the bin icon.</w:t>
-      </w:r>
-    </w:p>
-    <w:p>
-      <w:pPr>
-        <w:spacing w:after="0"/>
-      </w:pPr>
-    </w:p>
-    <w:p>
-      <w:pPr>
-        <w:pStyle w:val="Heading2"/>
-      </w:pPr>
-      <w:r>
-        <w:rPr/>
-        <w:t>Design credits</w:t>
+        <w:t>The bin deletes a field after you confirm. Measurements customers already saved keep their values.</w:t>
       </w:r>
     </w:p>
     <w:p>
@@ -6627,11 +7561,21 @@
         <w:rPr>
           <w:b/>
         </w:rPr>
-        <w:t>Show design credits on the website</w:t>
+        <w:t>“How to measure” video</w:t>
       </w:r>
       <w:r>
         <w:rPr/>
-        <w:t>: on means customers see their credits and each new AI design uses one; off means AI designs are free. Balances are kept either way.</w:t>
+        <w:t xml:space="preserve"> at the top: paste a YouTube link and press </w:t>
+      </w:r>
+      <w:r>
+        <w:rPr>
+          <w:b/>
+        </w:rPr>
+        <w:t>Save</w:t>
+      </w:r>
+      <w:r>
+        <w:rPr/>
+        <w:t>. Customers see it beside the fields.</w:t>
       </w:r>
     </w:p>
     <w:p>
@@ -6647,14 +7591,32 @@
         <w:tab/>
       </w:r>
       <w:r>
+        <w:rPr/>
+        <w:t xml:space="preserve">Which fields a garment asks for is ticked per garment in </w:t>
+      </w:r>
+      <w:r>
         <w:rPr>
           <w:b/>
         </w:rPr>
-        <w:t>Find a customer</w:t>
+        <w:t>Design Builder › Garments › Measurements asked for</w:t>
       </w:r>
       <w:r>
         <w:rPr/>
-        <w:t xml:space="preserve"> to add the credits they paid for. Corrections take a negative amount.</w:t>
+        <w:t>.</w:t>
+      </w:r>
+    </w:p>
+    <w:p>
+      <w:pPr>
+        <w:spacing w:after="0"/>
+      </w:pPr>
+    </w:p>
+    <w:p>
+      <w:pPr>
+        <w:pStyle w:val="Heading2"/>
+      </w:pPr>
+      <w:r>
+        <w:rPr/>
+        <w:t>Newsletter</w:t>
       </w:r>
     </w:p>
     <w:p>
@@ -6670,28 +7632,8 @@
         <w:tab/>
       </w:r>
       <w:r>
-        <w:rPr>
-          <w:b/>
-        </w:rPr>
-        <w:t>Your AI credit (OpenAI)</w:t>
-      </w:r>
-      <w:r>
         <w:rPr/>
-        <w:t>: open OpenAI billing, copy the dollar amount at the top of that page, and paste it here. The panel then shows roughly how many AI designs it can still make.</w:t>
-      </w:r>
-    </w:p>
-    <w:p>
-      <w:pPr>
-        <w:spacing w:after="0"/>
-      </w:pPr>
-    </w:p>
-    <w:p>
-      <w:pPr>
-        <w:pStyle w:val="Heading2"/>
-      </w:pPr>
-      <w:r>
-        <w:rPr/>
-        <w:t>Team (owners only)</w:t>
+        <w:t>Everyone who signed up on the website. Search by email.</w:t>
       </w:r>
     </w:p>
     <w:p>
@@ -6703,22 +7645,18 @@
         <w:ind w:left="369" w:hanging="283"/>
       </w:pPr>
       <w:r>
-        <w:t>1.</w:t>
+        <w:t>•</w:t>
         <w:tab/>
-      </w:r>
-      <w:r>
-        <w:rPr/>
-        <w:t xml:space="preserve">Open </w:t>
       </w:r>
       <w:r>
         <w:rPr>
           <w:b/>
         </w:rPr>
-        <w:t>Team</w:t>
+        <w:t>Export CSV</w:t>
       </w:r>
       <w:r>
         <w:rPr/>
-        <w:t xml:space="preserve"> from the menu.</w:t>
+        <w:t xml:space="preserve"> downloads a CSV for Shopify Email or Mailchimp. Nothing is emailed from the website itself.</w:t>
       </w:r>
     </w:p>
     <w:p>
@@ -6730,62 +7668,26 @@
         <w:ind w:left="369" w:hanging="283"/>
       </w:pPr>
       <w:r>
-        <w:t>2.</w:t>
+        <w:t>•</w:t>
         <w:tab/>
       </w:r>
       <w:r>
         <w:rPr/>
-        <w:t xml:space="preserve">Under </w:t>
-      </w:r>
-      <w:r>
-        <w:rPr>
-          <w:b/>
-        </w:rPr>
-        <w:t>Add a team member</w:t>
-      </w:r>
+        <w:t>Remove someone with the bin icon.</w:t>
+      </w:r>
+    </w:p>
+    <w:p>
+      <w:pPr>
+        <w:spacing w:after="0"/>
+      </w:pPr>
+    </w:p>
+    <w:p>
+      <w:pPr>
+        <w:pStyle w:val="Heading2"/>
+      </w:pPr>
       <w:r>
         <w:rPr/>
-        <w:t xml:space="preserve">, type their </w:t>
-      </w:r>
-      <w:r>
-        <w:rPr>
-          <w:b/>
-        </w:rPr>
-        <w:t>Name</w:t>
-      </w:r>
-      <w:r>
-        <w:rPr/>
-        <w:t xml:space="preserve">, </w:t>
-      </w:r>
-      <w:r>
-        <w:rPr>
-          <w:b/>
-        </w:rPr>
-        <w:t>Email</w:t>
-      </w:r>
-      <w:r>
-        <w:rPr/>
-        <w:t xml:space="preserve"> and a </w:t>
-      </w:r>
-      <w:r>
-        <w:rPr>
-          <w:b/>
-        </w:rPr>
-        <w:t>Password</w:t>
-      </w:r>
-      <w:r>
-        <w:rPr/>
-        <w:t xml:space="preserve"> (at least 8 characters), then press </w:t>
-      </w:r>
-      <w:r>
-        <w:rPr>
-          <w:b/>
-        </w:rPr>
-        <w:t>Add member</w:t>
-      </w:r>
-      <w:r>
-        <w:rPr/>
-        <w:t>.</w:t>
+        <w:t>Design credits</w:t>
       </w:r>
     </w:p>
     <w:p>
@@ -6797,18 +7699,19 @@
         <w:ind w:left="369" w:hanging="283"/>
       </w:pPr>
       <w:r>
-        <w:t>3.</w:t>
+        <w:t>•</w:t>
         <w:tab/>
       </w:r>
       <w:r>
+        <w:rPr>
+          <w:b/>
+        </w:rPr>
+        <w:t>Show design credits on the website</w:t>
+      </w:r>
+      <w:r>
         <w:rPr/>
-        <w:t>Share the email and password with them privately. They sign in at the normal admin login.</w:t>
-      </w:r>
-    </w:p>
-    <w:p>
-      <w:pPr>
-        <w:spacing w:after="0"/>
-      </w:pPr>
+        <w:t>: on means customers see their credits and each new AI design uses one; off means AI designs are free. Balances are kept either way.</w:t>
+      </w:r>
     </w:p>
     <w:p>
       <w:pPr>
@@ -6826,11 +7729,11 @@
         <w:rPr>
           <w:b/>
         </w:rPr>
-        <w:t>Can sign in</w:t>
+        <w:t>Find a customer</w:t>
       </w:r>
       <w:r>
         <w:rPr/>
-        <w:t xml:space="preserve"> switch: turn someone off without deleting them.</w:t>
+        <w:t xml:space="preserve"> to add the credits they paid for. Corrections take a negative amount.</w:t>
       </w:r>
     </w:p>
     <w:p>
@@ -6849,11 +7752,25 @@
         <w:rPr>
           <w:b/>
         </w:rPr>
-        <w:t>New password</w:t>
+        <w:t>Your AI credit (OpenAI)</w:t>
       </w:r>
       <w:r>
         <w:rPr/>
-        <w:t>: set a new password for them. They are signed out and must use the new one.</w:t>
+        <w:t>: open OpenAI billing, copy the dollar amount at the top of that page, and paste it here. The panel then shows roughly how many AI designs it can still make.</w:t>
+      </w:r>
+    </w:p>
+    <w:p>
+      <w:pPr>
+        <w:spacing w:after="0"/>
+      </w:pPr>
+    </w:p>
+    <w:p>
+      <w:pPr>
+        <w:pStyle w:val="Heading2"/>
+      </w:pPr>
+      <w:r>
+        <w:rPr/>
+        <w:t>Team (owners only)</w:t>
       </w:r>
     </w:p>
     <w:p>
@@ -6865,6 +7782,168 @@
         <w:ind w:left="369" w:hanging="283"/>
       </w:pPr>
       <w:r>
+        <w:t>1.</w:t>
+        <w:tab/>
+      </w:r>
+      <w:r>
+        <w:rPr/>
+        <w:t xml:space="preserve">Open </w:t>
+      </w:r>
+      <w:r>
+        <w:rPr>
+          <w:b/>
+        </w:rPr>
+        <w:t>Team</w:t>
+      </w:r>
+      <w:r>
+        <w:rPr/>
+        <w:t xml:space="preserve"> from the menu.</w:t>
+      </w:r>
+    </w:p>
+    <w:p>
+      <w:pPr>
+        <w:tabs>
+          <w:tab w:pos="369" w:val="left"/>
+        </w:tabs>
+        <w:spacing w:after="60"/>
+        <w:ind w:left="369" w:hanging="283"/>
+      </w:pPr>
+      <w:r>
+        <w:t>2.</w:t>
+        <w:tab/>
+      </w:r>
+      <w:r>
+        <w:rPr/>
+        <w:t xml:space="preserve">Under </w:t>
+      </w:r>
+      <w:r>
+        <w:rPr>
+          <w:b/>
+        </w:rPr>
+        <w:t>Add a team member</w:t>
+      </w:r>
+      <w:r>
+        <w:rPr/>
+        <w:t xml:space="preserve">, type their </w:t>
+      </w:r>
+      <w:r>
+        <w:rPr>
+          <w:b/>
+        </w:rPr>
+        <w:t>Name</w:t>
+      </w:r>
+      <w:r>
+        <w:rPr/>
+        <w:t xml:space="preserve">, </w:t>
+      </w:r>
+      <w:r>
+        <w:rPr>
+          <w:b/>
+        </w:rPr>
+        <w:t>Email</w:t>
+      </w:r>
+      <w:r>
+        <w:rPr/>
+        <w:t xml:space="preserve"> and a </w:t>
+      </w:r>
+      <w:r>
+        <w:rPr>
+          <w:b/>
+        </w:rPr>
+        <w:t>Password</w:t>
+      </w:r>
+      <w:r>
+        <w:rPr/>
+        <w:t xml:space="preserve"> (at least 8 characters), then press </w:t>
+      </w:r>
+      <w:r>
+        <w:rPr>
+          <w:b/>
+        </w:rPr>
+        <w:t>Add member</w:t>
+      </w:r>
+      <w:r>
+        <w:rPr/>
+        <w:t>.</w:t>
+      </w:r>
+    </w:p>
+    <w:p>
+      <w:pPr>
+        <w:tabs>
+          <w:tab w:pos="369" w:val="left"/>
+        </w:tabs>
+        <w:spacing w:after="60"/>
+        <w:ind w:left="369" w:hanging="283"/>
+      </w:pPr>
+      <w:r>
+        <w:t>3.</w:t>
+        <w:tab/>
+      </w:r>
+      <w:r>
+        <w:rPr/>
+        <w:t>Share the email and password with them privately. They sign in at the normal admin login.</w:t>
+      </w:r>
+    </w:p>
+    <w:p>
+      <w:pPr>
+        <w:spacing w:after="0"/>
+      </w:pPr>
+    </w:p>
+    <w:p>
+      <w:pPr>
+        <w:tabs>
+          <w:tab w:pos="369" w:val="left"/>
+        </w:tabs>
+        <w:spacing w:after="60"/>
+        <w:ind w:left="369" w:hanging="283"/>
+      </w:pPr>
+      <w:r>
+        <w:t>•</w:t>
+        <w:tab/>
+      </w:r>
+      <w:r>
+        <w:rPr>
+          <w:b/>
+        </w:rPr>
+        <w:t>Can sign in</w:t>
+      </w:r>
+      <w:r>
+        <w:rPr/>
+        <w:t xml:space="preserve"> switch: turn someone off without deleting them.</w:t>
+      </w:r>
+    </w:p>
+    <w:p>
+      <w:pPr>
+        <w:tabs>
+          <w:tab w:pos="369" w:val="left"/>
+        </w:tabs>
+        <w:spacing w:after="60"/>
+        <w:ind w:left="369" w:hanging="283"/>
+      </w:pPr>
+      <w:r>
+        <w:t>•</w:t>
+        <w:tab/>
+      </w:r>
+      <w:r>
+        <w:rPr>
+          <w:b/>
+        </w:rPr>
+        <w:t>New password</w:t>
+      </w:r>
+      <w:r>
+        <w:rPr/>
+        <w:t>: set a new password for them. They are signed out and must use the new one.</w:t>
+      </w:r>
+    </w:p>
+    <w:p>
+      <w:pPr>
+        <w:tabs>
+          <w:tab w:pos="369" w:val="left"/>
+        </w:tabs>
+        <w:spacing w:after="60"/>
+        <w:ind w:left="369" w:hanging="283"/>
+      </w:pPr>
+      <w:r>
         <w:t>•</w:t>
         <w:tab/>
       </w:r>
@@ -6876,7 +7955,17 @@
       </w:r>
       <w:r>
         <w:rPr/>
-        <w:t>: deletes their login after you confirm.</w:t>
+        <w:t xml:space="preserve">: deletes their login after you confirm. Owners can also remove another </w:t>
+      </w:r>
+      <w:r>
+        <w:rPr>
+          <w:b/>
+        </w:rPr>
+        <w:t>owner</w:t>
+      </w:r>
+      <w:r>
+        <w:rPr/>
+        <w:t xml:space="preserve"> account, for example an old test login. You can never remove your own account, and the last owner always stays, so someone can always sign in.</w:t>
       </w:r>
     </w:p>
     <w:p>
@@ -7063,7 +8152,7 @@
               <w:rPr>
                 <w:sz w:val="18"/>
               </w:rPr>
-              <w:t>Say which necklines an embroidery suits</w:t>
+              <w:t>Say what an embroidery goes with (neck, sleeve, length, lower, colour, dupatta)</w:t>
             </w:r>
           </w:p>
         </w:tc>
@@ -7080,6 +8169,40 @@
                 <w:sz w:val="18"/>
               </w:rPr>
               <w:t>AI Studio › step 1, or the pencil on its Saved embroidery card</w:t>
+            </w:r>
+          </w:p>
+        </w:tc>
+      </w:tr>
+      <w:tr>
+        <w:tc>
+          <w:tcPr>
+            <w:tcW w:type="dxa" w:w="4535"/>
+          </w:tcPr>
+          <w:p>
+            <w:pPr>
+              <w:spacing w:after="0"/>
+            </w:pPr>
+            <w:r>
+              <w:rPr>
+                <w:sz w:val="18"/>
+              </w:rPr>
+              <w:t>Extract embroidery on a salwar or pajama</w:t>
+            </w:r>
+          </w:p>
+        </w:tc>
+        <w:tc>
+          <w:tcPr>
+            <w:tcW w:type="dxa" w:w="5329"/>
+          </w:tcPr>
+          <w:p>
+            <w:pPr>
+              <w:spacing w:after="0"/>
+            </w:pPr>
+            <w:r>
+              <w:rPr>
+                <w:sz w:val="18"/>
+              </w:rPr>
+              <w:t>AI Studio › step 1 › Lower (salwar / pajama) photo</w:t>
             </w:r>
           </w:p>
         </w:tc>
@@ -7249,7 +8372,41 @@
               <w:rPr>
                 <w:sz w:val="18"/>
               </w:rPr>
-              <w:t>Design Builder › Garments</w:t>
+              <w:t>Design Builder › Garments › pencil on the card</w:t>
+            </w:r>
+          </w:p>
+        </w:tc>
+      </w:tr>
+      <w:tr>
+        <w:tc>
+          <w:tcPr>
+            <w:tcW w:type="dxa" w:w="4535"/>
+          </w:tcPr>
+          <w:p>
+            <w:pPr>
+              <w:spacing w:after="0"/>
+            </w:pPr>
+            <w:r>
+              <w:rPr>
+                <w:sz w:val="18"/>
+              </w:rPr>
+              <w:t>Delete a garment</w:t>
+            </w:r>
+          </w:p>
+        </w:tc>
+        <w:tc>
+          <w:tcPr>
+            <w:tcW w:type="dxa" w:w="5329"/>
+          </w:tcPr>
+          <w:p>
+            <w:pPr>
+              <w:spacing w:after="0"/>
+            </w:pPr>
+            <w:r>
+              <w:rPr>
+                <w:sz w:val="18"/>
+              </w:rPr>
+              <w:t>Design Builder › Garments › bin on the card</w:t>
             </w:r>
           </w:p>
         </w:tc>
@@ -7556,6 +8713,74 @@
                 <w:sz w:val="18"/>
               </w:rPr>
               <w:t>Team › Add a team member</w:t>
+            </w:r>
+          </w:p>
+        </w:tc>
+      </w:tr>
+      <w:tr>
+        <w:tc>
+          <w:tcPr>
+            <w:tcW w:type="dxa" w:w="4535"/>
+          </w:tcPr>
+          <w:p>
+            <w:pPr>
+              <w:spacing w:after="0"/>
+            </w:pPr>
+            <w:r>
+              <w:rPr>
+                <w:sz w:val="18"/>
+              </w:rPr>
+              <w:t>Remove an old login</w:t>
+            </w:r>
+          </w:p>
+        </w:tc>
+        <w:tc>
+          <w:tcPr>
+            <w:tcW w:type="dxa" w:w="5329"/>
+          </w:tcPr>
+          <w:p>
+            <w:pPr>
+              <w:spacing w:after="0"/>
+            </w:pPr>
+            <w:r>
+              <w:rPr>
+                <w:sz w:val="18"/>
+              </w:rPr>
+              <w:t>Team › Remove on that row</w:t>
+            </w:r>
+          </w:p>
+        </w:tc>
+      </w:tr>
+      <w:tr>
+        <w:tc>
+          <w:tcPr>
+            <w:tcW w:type="dxa" w:w="4535"/>
+          </w:tcPr>
+          <w:p>
+            <w:pPr>
+              <w:spacing w:after="0"/>
+            </w:pPr>
+            <w:r>
+              <w:rPr>
+                <w:sz w:val="18"/>
+              </w:rPr>
+              <w:t>Change measurement fields</w:t>
+            </w:r>
+          </w:p>
+        </w:tc>
+        <w:tc>
+          <w:tcPr>
+            <w:tcW w:type="dxa" w:w="5329"/>
+          </w:tcPr>
+          <w:p>
+            <w:pPr>
+              <w:spacing w:after="0"/>
+            </w:pPr>
+            <w:r>
+              <w:rPr>
+                <w:sz w:val="18"/>
+              </w:rPr>
+              <w:t>Measurement fields</w:t>
             </w:r>
           </w:p>
         </w:tc>

</xml_diff>